<commit_message>
Update JD experience to 0-2 years and add finance responsibilities
Co-Authored-By: Claude Opus 5.5 <noreply@anthropic.com>
Claude-Session: https://claude.ai/code/session_01DRS427TmedrgNWiwES9UMX
</commit_message>
<xml_diff>
--- a/JD_Product_Operations_Manager.docx
+++ b/JD_Product_Operations_Manager.docx
@@ -221,7 +221,7 @@
           <w:sz w:val="22"/>
           <w:szCs w:val="22"/>
         </w:rPr>
-        <w:t xml:space="preserve">1–3 years, MBA (Operations / Product) or equivalent</w:t>
+        <w:t xml:space="preserve">0–2 years, B.Tech / MMS / MSc (Finance) or equivalent</w:t>
       </w:r>
     </w:p>
     <w:p>
@@ -295,7 +295,7 @@
           <w:sz w:val="22"/>
           <w:szCs w:val="22"/>
         </w:rPr>
-        <w:t xml:space="preserve">Icestasy Projects is a gourmet ice cream manufacturer serving B2B customers across HORECA channels (hotels, restaurants, cafes) in Mumbai, Pune, Bangalore, Delhi, and Hyderabad. As the company scales across markets, we are building a product and operations layer that turns manual, person-dependent processes into standardised tools and workflows the whole team can rely on.</w:t>
+        <w:t xml:space="preserve">Icestasy Projects is a gourmet ice cream manufacturer serving B2B customers across HORECA channels (hotels, restaurants, cafes) in Mumbai, Pune, Bangalore, Delhi, and Hyderabad. As the company scales across markets, we are building a product, operations, and finance layer that turns manual, person-dependent processes into standardised tools and workflows, and gives leadership clear visibility into cost, margin, and cash.</w:t>
       </w:r>
     </w:p>
     <w:p>
@@ -323,7 +323,7 @@
           <w:sz w:val="22"/>
           <w:szCs w:val="22"/>
         </w:rPr>
-        <w:t xml:space="preserve">We are looking for a Product &amp; Operations Manager to identify operational friction across the business and convert it into working internal products, standard processes, and clear SOPs, reporting directly to the CEO. This role owns the full cycle: defining the problem, translating company policy into business rules, building or sourcing the solution, testing it against real output, rolling it out, and improving it based on usage.</w:t>
+        <w:t xml:space="preserve">We are looking for a Product &amp; Operations Manager to identify operational friction across the business and convert it into working internal products, standard processes, and clear SOPs, reporting directly to the CEO. Every process this role touches is viewed through a financial lens: what it costs, where margin leaks, and how it affects cash flow. This role owns the full cycle: defining the problem, translating company policy into business rules, building or sourcing the solution, testing it against real output, rolling it out, and improving it based on usage.</w:t>
       </w:r>
     </w:p>
     <w:p>
@@ -423,25 +423,43 @@
           <w:sz w:val="22"/>
           <w:szCs w:val="22"/>
         </w:rPr>
-        <w:t xml:space="preserve">Financial awareness: cost-to-company, unit costs, margins, and the impact of operational decisions on cash</w:t>
-      </w:r>
-    </w:p>
-    <w:p>
-      <w:pPr>
-        <w:pStyle w:val="ListParagraph"/>
-        <w:numPr>
-          <w:ilvl w:val="0"/>
-          <w:numId w:val="2"/>
-        </w:numPr>
-        <w:spacing w:after="60"/>
-      </w:pPr>
-      <w:r>
-        <w:rPr>
-          <w:rFonts w:ascii="Times New Roman" w:cs="Times New Roman" w:eastAsia="Times New Roman" w:hAnsi="Times New Roman"/>
-          <w:sz w:val="22"/>
-          <w:szCs w:val="22"/>
-        </w:rPr>
-        <w:t xml:space="preserve">Proficiency in Excel/Google Sheets, with comfort in no-code/low-code tools and basic web technologies</w:t>
+        <w:t xml:space="preserve">Financial modelling and analysis: cost structures, unit economics, margins, and working capital</w:t>
+      </w:r>
+    </w:p>
+    <w:p>
+      <w:pPr>
+        <w:pStyle w:val="ListParagraph"/>
+        <w:numPr>
+          <w:ilvl w:val="0"/>
+          <w:numId w:val="2"/>
+        </w:numPr>
+        <w:spacing w:after="60"/>
+      </w:pPr>
+      <w:r>
+        <w:rPr>
+          <w:rFonts w:ascii="Times New Roman" w:cs="Times New Roman" w:eastAsia="Times New Roman" w:hAnsi="Times New Roman"/>
+          <w:sz w:val="22"/>
+          <w:szCs w:val="22"/>
+        </w:rPr>
+        <w:t xml:space="preserve">Understanding of P&amp;L and cash flow, and the ability to quantify the financial impact of operational decisions</w:t>
+      </w:r>
+    </w:p>
+    <w:p>
+      <w:pPr>
+        <w:pStyle w:val="ListParagraph"/>
+        <w:numPr>
+          <w:ilvl w:val="0"/>
+          <w:numId w:val="2"/>
+        </w:numPr>
+        <w:spacing w:after="60"/>
+      </w:pPr>
+      <w:r>
+        <w:rPr>
+          <w:rFonts w:ascii="Times New Roman" w:cs="Times New Roman" w:eastAsia="Times New Roman" w:hAnsi="Times New Roman"/>
+          <w:sz w:val="22"/>
+          <w:szCs w:val="22"/>
+        </w:rPr>
+        <w:t xml:space="preserve">Proficiency in Excel/Google Sheets and familiarity with Tally, GST, and TDS; comfort with no-code/low-code tools and basic web technologies</w:t>
       </w:r>
     </w:p>
     <w:p>
@@ -648,24 +666,6 @@
           <w:sz w:val="22"/>
           <w:szCs w:val="22"/>
         </w:rPr>
-        <w:t xml:space="preserve">Partner with finance on cost visibility, including cost-to-company, unit economics, and margin reporting</w:t>
-      </w:r>
-    </w:p>
-    <w:p>
-      <w:pPr>
-        <w:pStyle w:val="ListParagraph"/>
-        <w:numPr>
-          <w:ilvl w:val="0"/>
-          <w:numId w:val="2"/>
-        </w:numPr>
-        <w:spacing w:after="60"/>
-      </w:pPr>
-      <w:r>
-        <w:rPr>
-          <w:rFonts w:ascii="Times New Roman" w:cs="Times New Roman" w:eastAsia="Times New Roman" w:hAnsi="Times New Roman"/>
-          <w:sz w:val="22"/>
-          <w:szCs w:val="22"/>
-        </w:rPr>
         <w:t xml:space="preserve">Act as the bridge between leadership intent and day-to-day execution</w:t>
       </w:r>
     </w:p>
@@ -681,6 +681,129 @@
           <w:sz w:val="23"/>
           <w:szCs w:val="23"/>
         </w:rPr>
+        <w:t xml:space="preserve">Finance &amp; Cost Control</w:t>
+      </w:r>
+    </w:p>
+    <w:p>
+      <w:pPr>
+        <w:pStyle w:val="ListParagraph"/>
+        <w:numPr>
+          <w:ilvl w:val="0"/>
+          <w:numId w:val="2"/>
+        </w:numPr>
+        <w:spacing w:after="60"/>
+      </w:pPr>
+      <w:r>
+        <w:rPr>
+          <w:rFonts w:ascii="Times New Roman" w:cs="Times New Roman" w:eastAsia="Times New Roman" w:hAnsi="Times New Roman"/>
+          <w:sz w:val="22"/>
+          <w:szCs w:val="22"/>
+        </w:rPr>
+        <w:t xml:space="preserve">Build and maintain cost models for products, SKUs, and customers, including raw material, packaging, freight, and manpower costs</w:t>
+      </w:r>
+    </w:p>
+    <w:p>
+      <w:pPr>
+        <w:pStyle w:val="ListParagraph"/>
+        <w:numPr>
+          <w:ilvl w:val="0"/>
+          <w:numId w:val="2"/>
+        </w:numPr>
+        <w:spacing w:after="60"/>
+      </w:pPr>
+      <w:r>
+        <w:rPr>
+          <w:rFonts w:ascii="Times New Roman" w:cs="Times New Roman" w:eastAsia="Times New Roman" w:hAnsi="Times New Roman"/>
+          <w:sz w:val="22"/>
+          <w:szCs w:val="22"/>
+        </w:rPr>
+        <w:t xml:space="preserve">Track gross margin by product and channel, and flag pricing or cost changes that erode it</w:t>
+      </w:r>
+    </w:p>
+    <w:p>
+      <w:pPr>
+        <w:pStyle w:val="ListParagraph"/>
+        <w:numPr>
+          <w:ilvl w:val="0"/>
+          <w:numId w:val="2"/>
+        </w:numPr>
+        <w:spacing w:after="60"/>
+      </w:pPr>
+      <w:r>
+        <w:rPr>
+          <w:rFonts w:ascii="Times New Roman" w:cs="Times New Roman" w:eastAsia="Times New Roman" w:hAnsi="Times New Roman"/>
+          <w:sz w:val="22"/>
+          <w:szCs w:val="22"/>
+        </w:rPr>
+        <w:t xml:space="preserve">Support the CEO with P&amp;L analysis, budgeting, and cash flow forecasting</w:t>
+      </w:r>
+    </w:p>
+    <w:p>
+      <w:pPr>
+        <w:pStyle w:val="ListParagraph"/>
+        <w:numPr>
+          <w:ilvl w:val="0"/>
+          <w:numId w:val="2"/>
+        </w:numPr>
+        <w:spacing w:after="60"/>
+      </w:pPr>
+      <w:r>
+        <w:rPr>
+          <w:rFonts w:ascii="Times New Roman" w:cs="Times New Roman" w:eastAsia="Times New Roman" w:hAnsi="Times New Roman"/>
+          <w:sz w:val="22"/>
+          <w:szCs w:val="22"/>
+        </w:rPr>
+        <w:t xml:space="preserve">Model manpower cost and compensation structures (cost-to-company vs take-home) to support hiring and salary decisions</w:t>
+      </w:r>
+    </w:p>
+    <w:p>
+      <w:pPr>
+        <w:pStyle w:val="ListParagraph"/>
+        <w:numPr>
+          <w:ilvl w:val="0"/>
+          <w:numId w:val="2"/>
+        </w:numPr>
+        <w:spacing w:after="60"/>
+      </w:pPr>
+      <w:r>
+        <w:rPr>
+          <w:rFonts w:ascii="Times New Roman" w:cs="Times New Roman" w:eastAsia="Times New Roman" w:hAnsi="Times New Roman"/>
+          <w:sz w:val="22"/>
+          <w:szCs w:val="22"/>
+        </w:rPr>
+        <w:t xml:space="preserve">Monitor working capital drivers, including inventory levels, receivables, and payables, and recommend actions to free up cash</w:t>
+      </w:r>
+    </w:p>
+    <w:p>
+      <w:pPr>
+        <w:pStyle w:val="ListParagraph"/>
+        <w:numPr>
+          <w:ilvl w:val="0"/>
+          <w:numId w:val="2"/>
+        </w:numPr>
+        <w:spacing w:after="60"/>
+      </w:pPr>
+      <w:r>
+        <w:rPr>
+          <w:rFonts w:ascii="Times New Roman" w:cs="Times New Roman" w:eastAsia="Times New Roman" w:hAnsi="Times New Roman"/>
+          <w:sz w:val="22"/>
+          <w:szCs w:val="22"/>
+        </w:rPr>
+        <w:t xml:space="preserve">Build ROI cases for new tools, processes, vendors, and investments before they are approved</w:t>
+      </w:r>
+    </w:p>
+    <w:p>
+      <w:pPr>
+        <w:spacing w:after="60" w:before="160"/>
+      </w:pPr>
+      <w:r>
+        <w:rPr>
+          <w:rFonts w:ascii="Times New Roman" w:cs="Times New Roman" w:eastAsia="Times New Roman" w:hAnsi="Times New Roman"/>
+          <w:b/>
+          <w:bCs/>
+          <w:sz w:val="23"/>
+          <w:szCs w:val="23"/>
+        </w:rPr>
         <w:t xml:space="preserve">Cross-Functional Coordination</w:t>
       </w:r>
     </w:p>
@@ -822,7 +945,7 @@
           <w:sz w:val="22"/>
           <w:szCs w:val="22"/>
         </w:rPr>
-        <w:t xml:space="preserve">Structured the output so employer cost stays within the agreed CTC, with cost-to-company and take-home shown separately</w:t>
+        <w:t xml:space="preserve">Structured the model so total employer cost stays within the agreed CTC, giving finance an accurate manpower cost per hire and separating cost-to-company from take-home</w:t>
       </w:r>
     </w:p>
     <w:p>
@@ -945,7 +1068,25 @@
           <w:sz w:val="22"/>
           <w:szCs w:val="22"/>
         </w:rPr>
-        <w:t xml:space="preserve">A live operations dashboard covering key business metrics for the CEO</w:t>
+        <w:t xml:space="preserve">Product-wise and channel-wise margin visibility, reviewed monthly with the CEO</w:t>
+      </w:r>
+    </w:p>
+    <w:p>
+      <w:pPr>
+        <w:pStyle w:val="ListParagraph"/>
+        <w:numPr>
+          <w:ilvl w:val="0"/>
+          <w:numId w:val="2"/>
+        </w:numPr>
+        <w:spacing w:after="60"/>
+      </w:pPr>
+      <w:r>
+        <w:rPr>
+          <w:rFonts w:ascii="Times New Roman" w:cs="Times New Roman" w:eastAsia="Times New Roman" w:hAnsi="Times New Roman"/>
+          <w:sz w:val="22"/>
+          <w:szCs w:val="22"/>
+        </w:rPr>
+        <w:t xml:space="preserve">A live operations and finance dashboard covering cost, margin, working capital, and key business metrics</w:t>
       </w:r>
     </w:p>
     <w:sectPr>

</xml_diff>